<commit_message>
docs(sow): clarify TowerCo acquisition baseline vs Vendor standby contingency rate card
</commit_message>
<xml_diff>
--- a/RFP_Tender_Package/Service SoW.docx
+++ b/RFP_Tender_Package/Service SoW.docx
@@ -88,17 +88,34 @@
           <w:i/>
           <w:sz w:val="19"/>
         </w:rPr>
-        <w:t>MANDATORY 3-TIER SITING HIERARCHY &amp; PHASE 1 BASELINE:</w:t>
+        <w:t>EXPLICIT GOVERNANCE: TOWERCO-LED ACQUISITION BASELINE VS. VENDOR CONTINGENCY RATE CARD</w:t>
         <w:br/>
-        <w:t>To achieve rapid rollout velocity while controlling civil capex, Bidders shall strictly adhere to the 3-Tier Siting Hierarchy:</w:t>
         <w:br/>
-        <w:t>• Tier 1 (Mandatory Baseline - 89.7% / 897 Sites): Co-location on existing operational towers (PTCI/MIDC, EdgePoint, FTAP Globe, FTAP Smart, LDIC) within the designated search ring.</w:t>
+        <w:t>1. PRIMARY OPERATIONAL BASELINE (TOWERCO-LED ACQUISITION):</w:t>
         <w:br/>
-        <w:t>• Tier 2 (Secondary Target): TowerCo Build-to-Suit (B2S) where existing structures lack load capacity.</w:t>
+        <w:t>The primary operational objective of the Operator is to utilize Independent Tower Companies (TowerCos) under Master Lease Agreements (MLA) — through Tier 1 (Existing Co-Location on audited 13,746 towers) and Tier 2 (TowerCo Build-to-Suit / B2S).</w:t>
         <w:br/>
-        <w:t>• Tier 3 (Restricted Exception - 10.3% / 103 Sites): Direct Operator Greenfield Monopole construction (80x 30m / 23x 40m).</w:t>
+        <w:t>Under this primary baseline, ALL Site Acquisition (SAQ) work — including candidate hunting, property due diligence, landlord leasing, Barangay clearances, LGU building permits, CAAP clearances, and commercial utility energization — is STRICTLY THE SCOPE AND FINANCIAL RESPONSIBILITY OF THE TOWERCO, NOT THE VENDOR.</w:t>
         <w:br/>
-        <w:t>Compensation adjustments resulting from field conversions shall be governed strictly via contractual variation orders using the firm unit rates established in this SOW.</w:t>
+        <w:br/>
+        <w:t>2. CANDIDATE HUNTING &amp; MANDATORY JOINT APPROVAL GATE:</w:t>
+        <w:br/>
+        <w:t>In actual operations, candidate hunting is conducted by the TowerCo. However, candidate acceptance is governed strictly by a Mandatory Joint Approval Gate:</w:t>
+        <w:br/>
+        <w:t>• Vendor Technical Vetting &amp; Endorsement: The Vendor must perform on-site technical vetting of the candidate for RF line-of-sight (LOS) to the demand settlement centroid, antenna mounting centerline/height, structural loading headroom (EPA), DC power availability, and cable routing feasibility. The Vendor must formally confirm or reject technical feasibility in the TSSR.</w:t>
+        <w:br/>
+        <w:t>• Operator Commercial &amp; Final Approval: The Operator (TelTech/Comclark) evaluates commercial viability, lease terms under MLA, and issues final formal approval to proceed.</w:t>
+        <w:br/>
+        <w:t>(No TowerCo candidate shall proceed to deployment without the joint technical endorsement of the Vendor and final approval of the Operator).</w:t>
+        <w:br/>
+        <w:br/>
+        <w:t>3. COMMERCIAL PURPOSE OF VENDOR SAQ RATE CARD (ITEMS SAQ-01 TO SAQ-08):</w:t>
+        <w:br/>
+        <w:t>The unit rates requested under Category 1 (Site Acquisition &amp; Permitting) are included in the Price Book STRICTLY AS A STANDBY / CONTINGENCY CALL-OFF RATE CARD ('Operator Self-Acquisition / Own-Build Option').</w:t>
+        <w:br/>
+        <w:t>The Operator requires firm unit pricing in the event that the Operator elects or is compelled to execute direct self-acquisition and self-build (Tier 3 Operator Greenfield Monopole) — such as in unserved remote search rings where zero TowerCos operate, or where all operational TowerCos issue formal structural denial letters or refuse to construct a Build-to-Suit tower.</w:t>
+        <w:br/>
+        <w:t>CRITICAL BIDDER INSTRUCTION: Bidders shall NOT embed site acquisition, land leasing, or municipal permitting risk markups inside their baseline turnkey hardware, installation (I&amp;C), or co-location pricing. Items SAQ-01 to SAQ-08 are evaluated as a standby rate card and are billable ONLY upon formal written Work Order issued by the Operator for an authorized self-acquired site.</w:t>
       </w:r>
     </w:p>
     <w:p>
@@ -849,7 +866,7 @@
               <w:rPr>
                 <w:sz w:val="16"/>
               </w:rPr>
-              <w:t>Field identification, screening, and ranking of three (3) viable candidates (Candidate A - Primary, Candidate B - Secondary, Candidate C - Contingency) within the assigned nominal search ring (500m radius for urban/suburban; 1,000m radius for rural). Mandatory spatial screening against audited TowerCo database (13,746 towers) to prioritize Tier 1 co-location. Scope includes visual inspection of antenna mounting feasibility, ground space availability (minimum 2.0m x 2.0m pad), line-of-sight to demand settlement centroid, road access verification (all-weather vs 4x4), and issuance of the Preliminary Candidate Evaluation Report (PCER).</w:t>
+              <w:t>[OPERATIONAL BASELINE: Siting and candidate hunting is executed by the TowerCo. Vendor performs on-site technical vetting (RF LOS, antenna height, structural feasibility) and issues joint endorsement; Operator issues final approval. COMMERCIAL PRICING BASIS: Quoted rate serves strictly as a Standby / Contingency Call-Off Rate Card for Operator Self-Acquisition / Own-Build]. Field identification, screening, and ranking of three (3) viable candidates (Candidate A - Primary, Candidate B - Secondary, Candidate C - Contingency) within the assigned nominal search ring (500m radius for urban/suburban; 1,000m radius for rural). Mandatory spatial screening against audited TowerCo database (13,746 towers) to prioritize Tier 1 co-location. Scope includes visual inspection of antenna mounting feasibility, ground space availability (minimum 2.0m x 2.0m pad), line-of-sight to demand settlement centroid, road access verification (all-weather vs 4x4), and issuance of the Preliminary Candidate Evaluation Report (PCER).</w:t>
               <w:br/>
               <w:t>• Inclusions: Desktop spatial analysis, physical on-ground hunting, 3 candidate identification, GPS logging, PCER compilation.</w:t>
               <w:br/>
@@ -1079,7 +1096,7 @@
               <w:rPr>
                 <w:sz w:val="16"/>
               </w:rPr>
-              <w:t>Comprehensive on-ground site acquisition audit and property investigation for the selected primary candidate. Compilation of standardized Site Acquisition Report (SAR) containing: official PSGC code, precision WGS84 GPS coordinates (&gt;= 6 decimal places), ground elevation AMSL, property cadastral boundary sketch, certified land title verification (TCT/OCT/Tax Declaration), lessor profile and contact matrix, preliminary structural condition assessment, preliminary power availability (grid connection point, transformer distance, utility provider), 360-degree panoramic site photos, logistics route access classification, and SAQ risk assessment matrix.</w:t>
+              <w:t>[OPERATIONAL BASELINE: TowerCo provides primary site attributes and property profile under MLA. Vendor reviews and compiles technical feasibility annex in TSSR; Operator signs off. COMMERCIAL PRICING BASIS: Standby / Contingency Call-Off Rate Card for full standalone SAR compilation during Operator Self-Acquisition]. Comprehensive on-ground site acquisition audit and property investigation for the selected primary candidate. Compilation of standardized Site Acquisition Report (SAR) containing: official PSGC code, precision WGS84 GPS coordinates (&gt;= 6 decimal places), ground elevation AMSL, property cadastral boundary sketch, certified land title verification (TCT/OCT/Tax Declaration), lessor profile and contact matrix, preliminary structural condition assessment, preliminary power availability (grid connection point, transformer distance, utility provider), 360-degree panoramic site photos, logistics route access classification, and SAQ risk assessment matrix.</w:t>
               <w:br/>
               <w:t>• Inclusions: On-ground cadastral audit, title verification, lessor interview, 360-deg photo sweep, complete SAR package.</w:t>
               <w:br/>
@@ -1309,7 +1326,7 @@
               <w:rPr>
                 <w:sz w:val="16"/>
               </w:rPr>
-              <w:t>Preparation, technical compilation, submission, and engineering follow-through of the TowerCo Space Application (SAA) package for co-location under Operator's Master Lease Agreement (MLA). Compiles exact proposed loading profile: 3x 8T8R RRU, 3x macro antennas/AAUs, antenna mounting brackets (AMB), hybrid trunk cables, DC distribution requirements, and ground plinth reservation (2.0m x 2.0m). Coordinates with TowerCo technical team during structural vetting until formal issuance of SAA Approval and Notice to Proceed (NTP).</w:t>
+              <w:t>[APPLIES TO TOWERCO CO-LOCATION: Preparation of technical equipment loading profile (3x 8T8R RRU, 3x Antennas, hybrid cables, 2m x 2m pad) and coordination with TowerCo engineering until SAA approval. Commercial lease executed directly by Operator under MLA]. Preparation, technical compilation, submission, and engineering follow-through of the TowerCo Space Application (SAA) package for co-location under Operator's Master Lease Agreement (MLA). Compiles exact proposed loading profile: 3x 8T8R RRU, 3x macro antennas/AAUs, antenna mounting brackets (AMB), hybrid trunk cables, DC distribution requirements, and ground plinth reservation (2.0m x 2.0m). Coordinates with TowerCo technical team during structural vetting until formal issuance of SAA Approval and Notice to Proceed (NTP).</w:t>
               <w:br/>
               <w:t>• Inclusions: SAA documentation, loading calculation submission, liaison with TowerCo engineering, tracking SAA to NTP.</w:t>
               <w:br/>
@@ -1539,7 +1556,7 @@
               <w:rPr>
                 <w:sz w:val="16"/>
               </w:rPr>
-              <w:t>Direct lessor negotiations for greenfield sites: boundary survey coordination, verification of registered ownership (clean title check at Registry of Deeds, inheritance/estate verification, real property tax clearance), negotiation of long-term lease terms (10-15 years) within Operator budgetary caps, preparation of lease annexes, securing lessor spousal consent and IDs, and facilitation of formal contract notarization and annotation on title.</w:t>
+              <w:t>[CONTINGENCY / SELF-BUILD SCOPE: Applicable strictly to Operator Own-Build Greenfield sites where no TowerCo exists or TowerCo denies build. Direct lessor negotiation, title due diligence, and lease notarization]. Direct lessor negotiations for greenfield sites: boundary survey coordination, verification of registered ownership (clean title check at Registry of Deeds, inheritance/estate verification, real property tax clearance), negotiation of long-term lease terms (10-15 years) within Operator budgetary caps, preparation of lease annexes, securing lessor spousal consent and IDs, and facilitation of formal contract notarization and annotation on title.</w:t>
               <w:br/>
               <w:t>• Inclusions: Lessor negotiations, title due diligence, boundary verification, notary liaison, lease execution assistance.</w:t>
               <w:br/>
@@ -1769,7 +1786,7 @@
               <w:rPr>
                 <w:sz w:val="16"/>
               </w:rPr>
-              <w:t>Securing official local community clearances: presentation to Barangay Council, public hearing facilitation (if mandated), processing and issuance of official Barangay Resolution of Support, Barangay Construction Clearance, and certified Neighborhood / Homeowners Association (HOA) Resolution / Certificate of No Objection from contiguous property owners within a 50-meter radius.</w:t>
+              <w:t>[OPERATIONAL BASELINE: TowerCo secures community/Barangay clearances for TowerCo towers. COMMERCIAL PRICING BASIS: Standby / Contingency Call-Off Rate Card for Operator Self-Acquisition / Greenfield sites]. Securing official local community clearances: presentation to Barangay Council, public hearing facilitation (if mandated), processing and issuance of official Barangay Resolution of Support, Barangay Construction Clearance, and certified Neighborhood / Homeowners Association (HOA) Resolution / Certificate of No Objection from contiguous property owners within a 50-meter radius.</w:t>
               <w:br/>
               <w:t>• Inclusions: Barangay consultations, neighbor signature campaigns, clearance filing and follow-through, official receipts.</w:t>
               <w:br/>
@@ -1999,7 +2016,7 @@
               <w:rPr>
                 <w:sz w:val="16"/>
               </w:rPr>
-              <w:t>Complete processing and procurement of municipal/city LGU Building Permits in accordance with the National Building Code of the Philippines (PD 1096). Scope includes securing Locational Clearance, Zoning Compliance, Architectural Permit, Civil/Structural Permit, Electrical Permit, Sanitary/Plumbing Permit, and Mechanical Permit, backed by complete sets of plans signed and sealed by licensed Professional Engineers (Civil, Structural, Electrical, PEE).</w:t>
+              <w:t>[OPERATIONAL BASELINE: TowerCo secures LGU Building Permits under PD 1096 for TowerCo towers. COMMERCIAL PRICING BASIS: Standby / Contingency Call-Off Rate Card for Operator Self-Build Greenfield Monopoles]. Complete processing and procurement of municipal/city LGU Building Permits in accordance with the National Building Code of the Philippines (PD 1096). Scope includes securing Locational Clearance, Zoning Compliance, Architectural Permit, Civil/Structural Permit, Electrical Permit, Sanitary/Plumbing Permit, and Mechanical Permit, backed by complete sets of plans signed and sealed by licensed Professional Engineers (Civil, Structural, Electrical, PEE).</w:t>
               <w:br/>
               <w:t>• Inclusions: Permit application filing, engineering plan liaison, follow-through across city/municipal engineering offices.</w:t>
               <w:br/>
@@ -2229,7 +2246,7 @@
               <w:rPr>
                 <w:sz w:val="16"/>
               </w:rPr>
-              <w:t>Procurement of mandatory national statutory clearances: Civil Aviation Authority of the Philippines (CAAP) Height Clearance Permit / Obstruction Evaluation; Department of Environment and Natural Resources (DENR) Certificate of Non-Coverage (CNC) or Environmental Compliance Certificate (ECC); and Department of Public Works and Highways (DPWH) Road Right-of-Way (ROW) clearance where site access fronts national highways.</w:t>
+              <w:t>[OPERATIONAL BASELINE: TowerCo secures CAAP Height Clearance and DENR CNC/ECC for TowerCo assets. COMMERCIAL PRICING BASIS: Standby / Contingency Call-Off Rate Card for Operator Self-Build Greenfield Monopoles]. Procurement of mandatory national statutory clearances: Civil Aviation Authority of the Philippines (CAAP) Height Clearance Permit / Obstruction Evaluation; Department of Environment and Natural Resources (DENR) Certificate of Non-Coverage (CNC) or Environmental Compliance Certificate (ECC); and Department of Public Works and Highways (DPWH) Road Right-of-Way (ROW) clearance where site access fronts national highways.</w:t>
               <w:br/>
               <w:t>• Inclusions: Technical submittals, coordinate and elevation certification, CAAP/DENR filing and technical defense.</w:t>
               <w:br/>
@@ -2459,7 +2476,7 @@
               <w:rPr>
                 <w:sz w:val="16"/>
               </w:rPr>
-              <w:t>Securing post-construction occupancy and power clearances: processing Certificate of Final Electrical Inspection (CFEI), Bureau of Fire Protection (BFP) Fire Safety Inspection Certificate (FSIC), commercial power utility (Meralco / Regional Electric Cooperative) service application, transformer tapping coordination, meter base energization, and municipal LGU Certificate of Final Occupancy / Permit to Operate.</w:t>
+              <w:t>[OPERATIONAL BASELINE: TowerCo manages utility service entrance and meter installation on shared compound. COMMERCIAL PRICING BASIS: Standby / Contingency Call-Off Rate Card for Operator Self-Build sites]. Securing post-construction occupancy and power clearances: processing Certificate of Final Electrical Inspection (CFEI), Bureau of Fire Protection (BFP) Fire Safety Inspection Certificate (FSIC), commercial power utility (Meralco / Regional Electric Cooperative) service application, transformer tapping coordination, meter base energization, and municipal LGU Certificate of Final Occupancy / Permit to Operate.</w:t>
               <w:br/>
               <w:t>• Inclusions: BFP inspection facilitation, CFEI filing, utility coordination, meter installation liaison, occupancy release.</w:t>
               <w:br/>

</xml_diff>

<commit_message>
fix(portal): resolve Recheck.md findings — live formulaic TCO variance checks, SAQ-03 co-location scope (897 sites), 60/80 ms satellite latency
</commit_message>
<xml_diff>
--- a/RFP_Tender_Package/Service SoW.docx
+++ b/RFP_Tender_Package/Service SoW.docx
@@ -150,7 +150,7 @@
         <w:t>The Contractor shall execute full turnkey Site Acquisition (SAQ) and permitting services. For each assigned nominal search ring (500m urban / 1,000m rural), the Contractor shall hunt and identify three (3) ranked candidates (Candidate A - Primary Co-location, Candidate B - Secondary Backup, Candidate C - Contingency). The Contractor shall submit a standardized Preliminary Candidate Evaluation Report (PCER) followed by a comprehensive Site Acquisition Report (SAR) containing precision WGS84 GPS coordinates (&gt;= 6 decimal places), ground elevation AMSL, property cadastral sketches, verified land title (TCT/OCT/Tax Dec), lessor profile, and 360-degree panoramic photos.</w:t>
         <w:br/>
         <w:br/>
-        <w:t>For Co-location sites (897 sites), the Contractor shall prepare the TowerCo Space Application (SAA) loading dossier under the Operator's Master Lease Agreement (MLA). For Greenfield sites (103 sites), the Contractor shall support private lease negotiation and notarization. Permitting scope includes end-to-end processing and securing of: Barangay Resolutions and Clearances, Homeowners Association (HOA) No Objection Resolutions, LGU Building Permits (Architectural, Structural, Civil, Electrical, Mechanical) under PD 1096, CAAP Height Clearance Permits, DENR Environmental CNC/ECC, DPWH ROW clearances, Certificate of Final Electrical Inspection (CFEI), BFP Fire Safety Inspection Certificate (FSIC), utility grid energization (Meralco / Electric Cooperative), and LGU Certificates of Occupancy.</w:t>
+        <w:t>For Co-location sites (897 sites), the Contractor shall prepare the TowerCo Space Application (SAA) loading dossier under the Operator's Master Lease Agreement (MLA). Site-Count &amp; Population Model: Phase 1 footprint is strictly 1,000 macro BTS sites total: 897 Sites (89.7%) are committed Tier 1 TowerCo Co-Locations. The remaining 103 Sites (10.3%) represent expansion positions where Tier 2 (TowerCo Build-to-Suit / B2S) and Tier 3 (Operator Own-Build Monopole) are mutually exclusive alternatives for the same 103 positions (total network remains strictly 1,000 sites, not 1,103). TelTech pursues Tier 2 B2S as primary; if B2S is denied or unviable, the site converts to Tier 3 Own-Build under pre-agreed Lot 5 civil and Standby SAQ rates. For Greenfield sites (103 sites), the Contractor shall support private lease negotiation and notarization. Permitting scope includes end-to-end processing and securing of: Barangay Resolutions and Clearances, Homeowners Association (HOA) No Objection Resolutions, LGU Building Permits (Architectural, Structural, Civil, Electrical, Mechanical) under PD 1096, CAAP Height Clearance Permits, DENR Environmental CNC/ECC, DPWH ROW clearances, Certificate of Final Electrical Inspection (CFEI), BFP Fire Safety Inspection Certificate (FSIC), utility grid energization (Meralco / Electric Cooperative), and LGU Certificates of Occupancy.</w:t>
       </w:r>
     </w:p>
     <w:p>
@@ -253,7 +253,7 @@
         <w:spacing w:after="160"/>
       </w:pPr>
       <w:r>
-        <w:t>Consists of three mandatory acceptance phases: (1) Mechanical &amp; Civil Acceptance (ATP-A): joint visual inspection of bolt torque marks, cable dressing, weatherproofing, grounding resistance (&lt;= 5.0 Ohms), and compound housekeeping. (2) Active Telecom Acceptance (ATP-B): remote EMS diagnostic verification of 8T8R MU-MIMO operation, remote eRET tilt control, and alarm failover simulations. (3) Single Site Verification (SSV): stationary throughput testing at near, mid, and cell-edge points per sector (validating &gt;= 450 Mbps peak DL, &gt;= 50 Mbps cell-edge DL, &gt;= 15 Mbps cell-edge UL), sector swap checks, handover tests, latency verification (Terrestrial Fiber: Target &lt;= 18 ms, Contractual Ceiling &lt;= 30 ms; Satellite: Target &lt;= 50 ms, Ceiling &lt;= 65 ms), and submission of the signed SSV Report.</w:t>
+        <w:t>Consists of three mandatory acceptance phases: (1) Mechanical &amp; Civil Acceptance (ATP-A): joint visual inspection of bolt torque marks, cable dressing, weatherproofing, grounding resistance (&lt;= 5.0 Ohms), and compound housekeeping. (2) Active Telecom Acceptance (ATP-B): remote EMS diagnostic verification of 8T8R MU-MIMO operation, remote eRET tilt control, and alarm failover simulations. (3) Single Site Verification (SSV): stationary throughput testing at near, mid, and cell-edge points per sector (validating &gt;= 450 Mbps peak DL, &gt;= 50 Mbps cell-edge DL, &gt;= 15 Mbps cell-edge UL), sector swap checks, handover tests, latency verification (Terrestrial Fiber: Target &lt;= 18 ms, Contractual Ceiling &lt;= 30 ms; Satellite: Target &lt;= 60 ms, Contractual Ceiling &lt;= 80 ms per Bid Bulletin 01 §2.3), and submission of the signed SSV Report.</w:t>
       </w:r>
     </w:p>
     <w:p>
@@ -1326,7 +1326,7 @@
               <w:rPr>
                 <w:sz w:val="16"/>
               </w:rPr>
-              <w:t>[APPLIES TO TOWERCO CO-LOCATION: Preparation of technical equipment loading profile (3x 8T8R RRU, 3x Antennas, hybrid cables, 2m x 2m pad) and coordination with TowerCo engineering until SAA approval. Commercial lease executed directly by Operator under MLA]. Preparation, technical compilation, submission, and engineering follow-through of the TowerCo Space Application (SAA) package for co-location under Operator's Master Lease Agreement (MLA). Compiles exact proposed loading profile: 3x 8T8R RRU, 3x macro antennas/AAUs, antenna mounting brackets (AMB), hybrid trunk cables, DC distribution requirements, and ground plinth reservation (2.0m x 2.0m). Coordinates with TowerCo technical team during structural vetting until formal issuance of SAA Approval and Notice to Proceed (NTP).</w:t>
+              <w:t>[COMMITTED TIER 1 CO-LOCATION SCOPE (897 SITES)]: Preparation of technical equipment loading profile (3x 8T8R RRU, 3x Antennas, hybrid cables, 2m x 2m pad) and coordination with TowerCo engineering until SAA approval. Commercial lease executed directly by Operator under MLA. Preparation, technical compilation, submission, and engineering follow-through of the TowerCo Space Application (SAA) package for co-location under Operator's Master Lease Agreement (MLA). Compiles exact proposed loading profile: 3x 8T8R RRU, 3x macro antennas/AAUs, antenna mounting brackets (AMB), hybrid trunk cables, DC distribution requirements, and ground plinth reservation (2.0m x 2.0m). Coordinates with TowerCo technical team during structural vetting until formal issuance of SAA Approval and Notice to Proceed (NTP).</w:t>
               <w:br/>
               <w:t>• Inclusions: SAA documentation, loading calculation submission, liaison with TowerCo engineering, tracking SAA to NTP.</w:t>
               <w:br/>
@@ -1378,7 +1378,7 @@
                 <w:b/>
                 <w:sz w:val="16"/>
               </w:rPr>
-              <w:t>103</w:t>
+              <w:t>897</w:t>
             </w:r>
           </w:p>
         </w:tc>
@@ -1402,7 +1402,7 @@
                 <w:b/>
                 <w:sz w:val="16"/>
               </w:rPr>
-              <w:t>515</w:t>
+              <w:t>4,485</w:t>
             </w:r>
           </w:p>
         </w:tc>
@@ -6971,9 +6971,9 @@
               <w:rPr>
                 <w:sz w:val="16"/>
               </w:rPr>
-              <w:t>On-ground field testing using 5G test UE and scanner: stationary throughput tests at near, mid, and cell-edge points per sector (validating &gt;= 450 Mbps peak DL, &gt;= 50 Mbps cell-edge DL, &gt;= 15 Mbps cell-edge UL); sector swap validation; intra-site handover execution; latency verification across backhaul media (Terrestrial Fiber: Target RTT &lt;= 18 ms to Core UPF, with Contractual Acceptance Rejection Ceiling &lt;= 30 ms per Appendix C KPI-RAN-07 and Bid Bulletin 01 §2.3; LEO Satellite Starlink / Expansion: Target RTT &lt;= 50 ms, Contractual Acceptance Rejection Ceiling &lt;= 65 ms); packet loss measurement (&lt; 0.1%); and compilation and formal sign-off of the comprehensive SSV Report.</w:t>
+              <w:t>On-ground field testing using 5G test UE and scanner: stationary throughput tests at near, mid, and cell-edge points per sector (validating &gt;= 450 Mbps peak DL, &gt;= 50 Mbps cell-edge DL, &gt;= 15 Mbps cell-edge UL); sector swap validation; intra-site handover execution; latency verification across backhaul media (Terrestrial Fiber: Target RTT &lt;= 18 ms to Core UPF, with Contractual Acceptance Rejection Ceiling &lt;= 30 ms per Appendix C KPI-RAN-07 and Bid Bulletin 01 §2.3; LEO Satellite Starlink / Expansion: Target RTT &lt;= 60 ms, Contractual Acceptance Rejection Ceiling &lt;= 80 ms per Bid Bulletin 01 §2.3); packet loss measurement (&lt; 0.1%); and compilation and formal sign-off of the comprehensive SSV Report.</w:t>
               <w:br/>
-              <w:t>• Inclusions: Stationary throughput tests, sector swap check, handover test, latency compliance test (&lt;= 30 ms fiber ceiling / &lt;= 65 ms satellite ceiling), SSV report compilation.</w:t>
+              <w:t>• Inclusions: Stationary throughput tests, sector swap check, handover test, latency compliance test (&lt;= 30 ms fiber ceiling / &lt;= 80 ms satellite ceiling), SSV report compilation.</w:t>
               <w:br/>
               <w:t>• Exclusions: Multi-site cluster drive testing (covered under Category 7).</w:t>
             </w:r>

</xml_diff>

<commit_message>
fix(appendix-e): harmonize RF planning scope RNPD-01 and TI-05 with Bulletin 02 60 MHz baseline and software-expandable provincial modeling
</commit_message>
<xml_diff>
--- a/RFP_Tender_Package/Service SoW.docx
+++ b/RFP_Tender_Package/Service SoW.docx
@@ -4133,10 +4133,7 @@
           </w:tcPr>
           <w:p>
             <w:r>
-              <w:rPr>
-                <w:sz w:val="16"/>
-              </w:rPr>
-              <w:t>Macro-level 5G RF network planning using advanced 3D ray-tracing propagation modeling engines, calibrated against high-resolution 5-meter clutter models and Digital Terrain Models (DTM). Sizing and generation of nominal candidate search rings across high-density suburban and rural barangay centroids; multi-carrier capacity dimensioning for Band n50 (60 MHz NCR / up to 80 MHz Provincial, Software-Configurable 40/50/60/80 MHz TDD); coverage prediction mapping (RSRP, SINR, Best Server, Downlink/Uplink Throughput); and inter-site distance (ISD) optimization.</w:t>
+              <w:t>Macro-level 5G RF network planning using advanced 3D ray-tracing propagation modeling engines, calibrated against high-resolution 5-meter clutter models and Digital Terrain Models (DTM). Sizing and generation of nominal candidate search rings across high-density suburban and rural barangay centroids; multi-carrier capacity dimensioning for Band n50 based on the authorized 60 MHz continuous TDD baseline (1457.0–1517.0 MHz) nationwide for contractual evaluation, with future software-expandable sensitivity modeling up to 80 MHz in provincial clusters (pursuant to Bulletin No. 2 §3.1); coverage prediction mapping (RSRP, SINR, Best Server, Downlink/Uplink Throughput); and inter-site distance (ISD) optimization.</w:t>
               <w:br/>
               <w:t>• Inclusions: 3D ray-tracing simulation, clutter model calibration, nominal site planning, search ring generation.</w:t>
               <w:br/>
@@ -6253,10 +6250,7 @@
           </w:tcPr>
           <w:p>
             <w:r>
-              <w:rPr>
-                <w:sz w:val="16"/>
-              </w:rPr>
-              <w:t>Transmission IP integration (VLAN, BGP, IPsec); establishing S1-U / N2/N3 control and user plane interfaces to 5G Core (AMF/UPF); synchronization with TelTech EMS/OSS; activating 3 sectors on Band n50 (60 MHz NCR / up to 80 MHz Provincial, Software-Configurable 40/50/60/80 MHz TDD); clearing all active alarms; and achieving stable commercial on-air operational state.</w:t>
+              <w:t>Transmission IP integration (VLAN, BGP, IPsec); establishing S1-U / N2/N3 control and user plane interfaces to 5G Core (AMF/UPF); synchronization with TelTech EMS/OSS; activating 3 sectors on Band n50 on the authorized 60 MHz continuous TDD carrier (1457.0–1517.0 MHz, with hardware wideband tuning across 1432.0–1517.0 MHz and software-configurable support up to 80 MHz TDD pursuant to Bulletin No. 2 §3.1); clearing all active alarms; and achieving stable commercial on-air operational state.</w:t>
               <w:br/>
               <w:t>• Inclusions: IP configuration, Core integration, OSS synchronization, carrier activation, alarm clearance.</w:t>
               <w:br/>

</xml_diff>